<commit_message>
Enhance multilingual support by adding French and Italian language options in the application. Update letter generation and rendering services to accommodate new languages, including localized date formatting and salutation handling. Introduce language switcher component for user interface and update message files for English, French, German, and Italian. Refactor API routes to utilize the new locale management system.
</commit_message>
<xml_diff>
--- a/apps/api/template_official.docx
+++ b/apps/api/template_official.docx
@@ -150,7 +150,30 @@
           <w:b/>
           <w:lang w:val="de-CH"/>
         </w:rPr>
-        <w:t xml:space="preserve">Bewerbung als </w:t>
+        <w:t>{{</w:t>
+      </w:r>
+      <w:proofErr w:type="spellStart"/>
+      <w:r>
+        <w:rPr>
+          <w:b/>
+          <w:lang w:val="de-CH"/>
+        </w:rPr>
+        <w:t>application_for</w:t>
+      </w:r>
+      <w:proofErr w:type="spellEnd"/>
+      <w:r>
+        <w:rPr>
+          <w:b/>
+          <w:lang w:val="de-CH"/>
+        </w:rPr>
+        <w:t xml:space="preserve">}} </w:t>
+      </w:r>
+      <w:r>
+        <w:rPr>
+          <w:b/>
+          <w:lang w:val="de-CH"/>
+        </w:rPr>
+        <w:t xml:space="preserve"> </w:t>
       </w:r>
       <w:r>
         <w:rPr>
@@ -220,13 +243,21 @@
         <w:rPr>
           <w:lang w:val="de-CH"/>
         </w:rPr>
-        <w:t>Freundliche</w:t>
+        <w:t>{{</w:t>
       </w:r>
+      <w:proofErr w:type="spellStart"/>
       <w:r>
         <w:rPr>
           <w:lang w:val="de-CH"/>
         </w:rPr>
-        <w:t xml:space="preserve"> Grüsse</w:t>
+        <w:t>greetings</w:t>
+      </w:r>
+      <w:proofErr w:type="spellEnd"/>
+      <w:r>
+        <w:rPr>
+          <w:lang w:val="de-CH"/>
+        </w:rPr>
+        <w:t>}}</w:t>
       </w:r>
     </w:p>
     <w:p>

</xml_diff>